<commit_message>
3.3 (gonderilen dosya): paragraf aralarina 6 gorsel (C, D, G, H, I, J) ve Bilgi Kosesi 3.4 altina 2 gorsel; eski C, D -> E, F; ayri ek gorsel dosyasi kaldirildi
</commit_message>
<xml_diff>
--- a/YayinaYollananlar/Kim11-3-3-Mikroplastikler-29-10-2026.docx
+++ b/YayinaYollananlar/Kim11-3-3-Mikroplastikler-29-10-2026.docx
@@ -1513,7 +1513,7 @@
           <w:rFonts w:ascii="Times New Roman" w:hAnsi="Times New Roman" w:cs="Times New Roman"/>
           <w:lang w:val="tr-TR"/>
         </w:rPr>
-        <w:t xml:space="preserve">Analiz ve Keşif Atölyesi 3.3.’te etkilerini araştırdığınız küçük plastik parçacıkların kaynağı, günlük hayatta kullandığımız plastik ürünlerdir. Peki, plastikler neden bu kadar yaygın kullanılır ve doğada neden kolayca yok olmaz? Plastikler, çoğunlukla petrol ve doğal gaz gibi fosil kaynaklardan, bazen de selüloz gibi doğal maddelerden elde edilen sentetik ya da yarı sentetik polimer malzemelerdir. Polimerler, monomer adı verilen küçük moleküllerin çok sayıda birbirine bağlanmasıyla oluşan büyük moleküllerdir. Plastikler hafif, dayanıklı, ucuz ve kolay şekil verilebilir olmaları nedeniyle ambalajdan tekstile, tıbbi malzemelerden otomotiv sanayisine kadar birçok alanda kullanılır. Ancak plastiklerin çoğu mikroorganizmalar tarafından kolayca parçalanamadığı için doğada yüzlerce yıl kalabilir. Örneğin kıyıya atılmış bir pet şişe zamanla gözden kaybolsa da yok olmaz: Güneşin morötesi ışınları polimer zincirlerindeki bazı bağları kırarak plastiği kırılgan hâle getirir; dalgalar, rüzgâr, kum taneleriyle sürtünme ve sıcaklık değişimleri ise kırılganlaşan plastiğin giderek daha küçük parçalara ayrılmasına neden olur. Bu küçük plastik parçacıklar boyutlarına göre adlandırılır. Boyutu 5 mm’den küçük, 1 mikrometreden (1 µm = 10</w:t>
+        <w:t xml:space="preserve">Analiz ve Keşif Atölyesi 3.3.’te etkilerini araştırdığınız küçük plastik parçacıkların kaynağı, günlük hayatta kullandığımız plastik ürünlerdir. Peki, plastikler neden bu kadar yaygın kullanılır ve doğada neden kolayca yok olmaz? Plastikler, çoğunlukla petrol ve doğal gaz gibi fosil kaynaklardan, bazen de selüloz gibi doğal maddelerden elde edilen sentetik ya da yarı sentetik polimer malzemelerdir. Polimerler, monomer adı verilen küçük moleküllerin çok sayıda birbirine bağlanmasıyla oluşan büyük moleküllerdir. Plastikler hafif, dayanıklı, ucuz ve kolay şekil verilebilir olmaları nedeniyle ambalajdan tekstile, tıbbi malzemelerden otomotiv sanayisine kadar birçok alanda kullanılır. Ancak plastiklerin çoğu mikroorganizmalar tarafından kolayca parçalanamadığı için doğada yüzlerce yıl kalabilir. Örneğin kıyıya atılmış bir pet şişe (Görsel C) zamanla gözden kaybolsa da yok olmaz: Güneşin morötesi ışınları polimer zincirlerindeki bazı bağları kırarak plastiği kırılgan hâle getirir; dalgalar, rüzgâr, kum taneleriyle sürtünme ve sıcaklık değişimleri ise kırılganlaşan plastiğin giderek daha küçük parçalara ayrılmasına neden olur (Görsel D). Bu küçük plastik parçacıklar boyutlarına göre adlandırılır. Boyutu 5 mm’den küçük, 1 mikrometreden (1 µm = 10</w:t>
       </w:r>
       <w:r>
         <w:rPr>
@@ -1531,6 +1531,195 @@
         <w:t xml:space="preserve"> m = 1000 nm) büyük plastik parçacıklara mikroplastik denir. Boyutu genellikle 100 nm’den küçük olan plastik parçacıklara ise nanoplastik denir. Bazı bilimsel kaynaklar 1 µm’den küçük tüm plastik parçacıkları nanoplastik olarak sınıflandırdığından nanoplastik için kullanılan üst sınır kaynaklara göre farklılık gösterebilir.</w:t>
       </w:r>
     </w:p>
+    <w:tbl>
+      <w:tblPr>
+        <w:tblW w:w="9000" w:type="dxa"/>
+        <w:jc w:val="center"/>
+        <w:tblBorders>
+          <w:top w:val="nil"/>
+          <w:left w:val="nil"/>
+          <w:bottom w:val="nil"/>
+          <w:right w:val="nil"/>
+          <w:insideH w:val="nil"/>
+          <w:insideV w:val="nil"/>
+        </w:tblBorders>
+        <w:tblLayout w:type="fixed"/>
+      </w:tblPr>
+      <w:tblGrid>
+        <w:gridCol w:w="4500"/>
+        <w:gridCol w:w="4500"/>
+      </w:tblGrid>
+      <w:tr>
+        <w:tc>
+          <w:tcPr>
+            <w:tcW w:w="4500" w:type="dxa"/>
+          </w:tcPr>
+          <w:p>
+            <w:pPr>
+              <w:jc w:val="center"/>
+            </w:pPr>
+            <w:r>
+              <w:drawing>
+                <wp:inline xmlns:a="http://schemas.openxmlformats.org/drawingml/2006/main" xmlns:pic="http://schemas.openxmlformats.org/drawingml/2006/picture">
+                  <wp:extent cx="2628000" cy="1662648"/>
+                  <wp:docPr id="900011" name="Picture 900011"/>
+                  <wp:cNvGraphicFramePr>
+                    <a:graphicFrameLocks noChangeAspect="1"/>
+                  </wp:cNvGraphicFramePr>
+                  <a:graphic>
+                    <a:graphicData uri="http://schemas.openxmlformats.org/drawingml/2006/picture">
+                      <pic:pic>
+                        <pic:nvPicPr>
+                          <pic:cNvPr id="0" name="2628605345_d.jpg"/>
+                          <pic:cNvPicPr/>
+                        </pic:nvPicPr>
+                        <pic:blipFill>
+                          <a:blip r:embed="rId15"/>
+                          <a:stretch>
+                            <a:fillRect/>
+                          </a:stretch>
+                        </pic:blipFill>
+                        <pic:spPr>
+                          <a:xfrm>
+                            <a:off x="0" y="0"/>
+                            <a:ext cx="2628000" cy="1662648"/>
+                          </a:xfrm>
+                          <a:prstGeom prst="rect"/>
+                        </pic:spPr>
+                      </pic:pic>
+                    </a:graphicData>
+                  </a:graphic>
+                </wp:inline>
+              </w:drawing>
+            </w:r>
+          </w:p>
+          <w:p>
+            <w:pPr>
+              <w:jc w:val="center"/>
+            </w:pPr>
+            <w:r>
+              <w:rPr>
+                <w:rFonts w:ascii="Times New Roman" w:hAnsi="Times New Roman" w:cs="Times New Roman"/>
+                <w:b/>
+                <w:bCs/>
+                <w:highlight w:val="yellow"/>
+                <w:lang w:val="tr-TR"/>
+              </w:rPr>
+              <w:t xml:space="preserve">Shutter id: 2628605345</w:t>
+            </w:r>
+          </w:p>
+          <w:p>
+            <w:pPr>
+              <w:jc w:val="center"/>
+              <w:rPr>
+                <w:rFonts w:ascii="Times New Roman" w:hAnsi="Times New Roman" w:cs="Times New Roman"/>
+                <w:lang w:val="tr-TR"/>
+              </w:rPr>
+            </w:pPr>
+            <w:r>
+              <w:rPr>
+                <w:rFonts w:ascii="Times New Roman" w:hAnsi="Times New Roman" w:cs="Times New Roman"/>
+                <w:b/>
+                <w:bCs/>
+                <w:lang w:val="tr-TR"/>
+              </w:rPr>
+              <w:t xml:space="preserve">Görsel C:</w:t>
+            </w:r>
+            <w:r>
+              <w:rPr>
+                <w:rFonts w:ascii="Times New Roman" w:hAnsi="Times New Roman" w:cs="Times New Roman"/>
+                <w:lang w:val="tr-TR"/>
+              </w:rPr>
+              <w:t xml:space="preserve"> Kıyıda zamanla parçalanan bir pet şişe</w:t>
+            </w:r>
+          </w:p>
+        </w:tc>
+        <w:tc>
+          <w:tcPr>
+            <w:tcW w:w="4500" w:type="dxa"/>
+          </w:tcPr>
+          <w:p>
+            <w:pPr>
+              <w:jc w:val="center"/>
+            </w:pPr>
+            <w:r>
+              <w:drawing>
+                <wp:inline xmlns:a="http://schemas.openxmlformats.org/drawingml/2006/main" xmlns:pic="http://schemas.openxmlformats.org/drawingml/2006/picture">
+                  <wp:extent cx="2628000" cy="1564536"/>
+                  <wp:docPr id="900011" name="Picture 900011"/>
+                  <wp:cNvGraphicFramePr>
+                    <a:graphicFrameLocks noChangeAspect="1"/>
+                  </wp:cNvGraphicFramePr>
+                  <a:graphic>
+                    <a:graphicData uri="http://schemas.openxmlformats.org/drawingml/2006/picture">
+                      <pic:pic>
+                        <pic:nvPicPr>
+                          <pic:cNvPr id="0" name="2666240247_d.jpg"/>
+                          <pic:cNvPicPr/>
+                        </pic:nvPicPr>
+                        <pic:blipFill>
+                          <a:blip r:embed="rId16"/>
+                          <a:stretch>
+                            <a:fillRect/>
+                          </a:stretch>
+                        </pic:blipFill>
+                        <pic:spPr>
+                          <a:xfrm>
+                            <a:off x="0" y="0"/>
+                            <a:ext cx="2628000" cy="1564536"/>
+                          </a:xfrm>
+                          <a:prstGeom prst="rect"/>
+                        </pic:spPr>
+                      </pic:pic>
+                    </a:graphicData>
+                  </a:graphic>
+                </wp:inline>
+              </w:drawing>
+            </w:r>
+          </w:p>
+          <w:p>
+            <w:pPr>
+              <w:jc w:val="center"/>
+            </w:pPr>
+            <w:r>
+              <w:rPr>
+                <w:rFonts w:ascii="Times New Roman" w:hAnsi="Times New Roman" w:cs="Times New Roman"/>
+                <w:b/>
+                <w:bCs/>
+                <w:highlight w:val="yellow"/>
+                <w:lang w:val="tr-TR"/>
+              </w:rPr>
+              <w:t xml:space="preserve">Shutter id: 2666240247</w:t>
+            </w:r>
+          </w:p>
+          <w:p>
+            <w:pPr>
+              <w:jc w:val="center"/>
+              <w:rPr>
+                <w:rFonts w:ascii="Times New Roman" w:hAnsi="Times New Roman" w:cs="Times New Roman"/>
+                <w:lang w:val="tr-TR"/>
+              </w:rPr>
+            </w:pPr>
+            <w:r>
+              <w:rPr>
+                <w:rFonts w:ascii="Times New Roman" w:hAnsi="Times New Roman" w:cs="Times New Roman"/>
+                <w:b/>
+                <w:bCs/>
+                <w:lang w:val="tr-TR"/>
+              </w:rPr>
+              <w:t xml:space="preserve">Görsel D:</w:t>
+            </w:r>
+            <w:r>
+              <w:rPr>
+                <w:rFonts w:ascii="Times New Roman" w:hAnsi="Times New Roman" w:cs="Times New Roman"/>
+                <w:lang w:val="tr-TR"/>
+              </w:rPr>
+              <w:t xml:space="preserve"> Kıyıdan toplanan küçük plastik parçacıklar</w:t>
+            </w:r>
+          </w:p>
+        </w:tc>
+      </w:tr>
+    </w:tbl>
     <w:p>
       <w:pPr>
         <w:jc w:val="both"/>
@@ -1544,7 +1733,7 @@
           <w:rFonts w:ascii="Times New Roman" w:hAnsi="Times New Roman" w:cs="Times New Roman"/>
           <w:lang w:val="tr-TR"/>
         </w:rPr>
-        <w:t xml:space="preserve">Kıyıdaki pet şişeden kopan parçacıklar ile bazı yüz temizleme jellerindeki küçük plastik boncuklar çevreye farklı yollardan ulaşır. Bu nedenle mikroplastikler kaynaklarına göre iki grupta incelenir. Birincil mikroplastikler, doğrudan küçük boyutta üretilen ya da ürünlerin kullanımı sırasında küçük parçacıklar hâlinde çevreye salınan plastiklerdir. Bazı kozmetik ve temizlik ürünlerindeki mikroboncuklar, plastik eşya üretmek için eritilmeye hazır bekleyen mercimek büyüklüğündeki plastik taneler (pelet) (Görsel C), sentetik kumaşların yıkanması sırasında kopan lifler (mikrofiberler) ve araç lastiklerinin yolda aşınmasıyla oluşan parçacıklar birincil mikroplastiklere örnektir (Görsel D). İkincil mikroplastikler ise plastik şişe, poşet, ambalaj ve balık ağı gibi büyük plastik atıkların doğada parçalanmasıyla oluşur. Nanoplastikler çoğunlukla mikroplastiklerin zamanla daha da ufalanmasıyla ortaya çıkar.</w:t>
+        <w:t xml:space="preserve">Kıyıdaki pet şişeden kopan parçacıklar ile bazı yüz temizleme jellerindeki küçük plastik boncuklar çevreye farklı yollardan ulaşır. Bu nedenle mikroplastikler kaynaklarına göre iki grupta incelenir. Birincil mikroplastikler, doğrudan küçük boyutta üretilen ya da ürünlerin kullanımı sırasında küçük parçacıklar hâlinde çevreye salınan plastiklerdir. Bazı kozmetik ve temizlik ürünlerindeki mikroboncuklar, plastik eşya üretmek için eritilmeye hazır bekleyen mercimek büyüklüğündeki plastik taneler (pelet) (Görsel E), sentetik kumaşların yıkanması sırasında kopan lifler (mikrofiberler) ve araç lastiklerinin yolda aşınmasıyla oluşan parçacıklar birincil mikroplastiklere örnektir (Görsel F). İkincil mikroplastikler ise plastik şişe, poşet, ambalaj ve balık ağı gibi büyük plastik atıkların doğada parçalanmasıyla oluşur. Nanoplastikler çoğunlukla mikroplastiklerin zamanla daha da ufalanmasıyla ortaya çıkar.</w:t>
       </w:r>
     </w:p>
     <w:tbl>
@@ -1639,7 +1828,7 @@
                 <w:bCs/>
                 <w:lang w:val="tr-TR"/>
               </w:rPr>
-              <w:t xml:space="preserve">Görsel C:</w:t>
+              <w:t xml:space="preserve">Görsel E:</w:t>
             </w:r>
             <w:r>
               <w:rPr>
@@ -1723,7 +1912,7 @@
                 <w:bCs/>
                 <w:lang w:val="tr-TR"/>
               </w:rPr>
-              <w:t xml:space="preserve">Görsel D:</w:t>
+              <w:t xml:space="preserve">Görsel F:</w:t>
             </w:r>
             <w:r>
               <w:rPr>
@@ -1749,9 +1938,198 @@
           <w:rFonts w:ascii="Times New Roman" w:hAnsi="Times New Roman" w:cs="Times New Roman"/>
           <w:lang w:val="tr-TR"/>
         </w:rPr>
-        <w:t xml:space="preserve">Mikroplastik ve nanoplastikler deniz ve tatlı sulardan toprağa, havadan içme suyuna kadar pek çok ortamda tespit edilmiştir. Su canlıları tarafından besin sanılarak yutulan mikroplastikler besin zinciri yoluyla insanlara kadar ulaşabilir. Planktonla beslenen küçük balıkları yiyen büyük balıklar çok sayıda küçük balık tükettiğinden, besin zincirinin üst basamaklarındaki canlılarda plastik parçacıklar ve taşıdıkları kimyasallar daha fazla birikebilir. Topraktaki mikroplastikler toprağın yapısını ve topraktaki faydalı mikroorganizmaları olumsuz etkileyebilir; kirli sularla sulanan bitkilerin kökleri çok küçük parçacıkları alabilir. Plastik parçacıkların yüzeyi, sudaki bazı zararlı kimyasalları ve mikroorganizmaları tutabilir. Ayrıca plastiklerin yapısına katılan bazı katkı maddeleri parçacıklardan çevreye geçebilir. Nanoplastiklerin çok küçük boyutları nedeniyle hücre zarlarından geçebilme olasılığı bulunmaktadır. Mikroplastik ve nanoplastiklerin insan sağlığına uzun süreli etkilerine ilişkin araştırmalar sürmektedir.</w:t>
+        <w:t xml:space="preserve">Mikroplastik ve nanoplastikler deniz ve tatlı sulardan toprağa, havadan içme suyuna kadar pek çok ortamda tespit edilmiştir. Su canlıları tarafından besin sanılarak yutulan mikroplastikler besin zinciri yoluyla insanlara kadar ulaşabilir (Görsel G). Planktonla beslenen küçük balıkları yiyen büyük balıklar çok sayıda küçük balık tükettiğinden, besin zincirinin üst basamaklarındaki canlılarda plastik parçacıklar ve taşıdıkları kimyasallar daha fazla birikebilir. Topraktaki mikroplastikler toprağın yapısını ve topraktaki faydalı mikroorganizmaları olumsuz etkileyebilir (Görsel H); kirli sularla sulanan bitkilerin kökleri çok küçük parçacıkları alabilir. Plastik parçacıkların yüzeyi, sudaki bazı zararlı kimyasalları ve mikroorganizmaları tutabilir. Ayrıca plastiklerin yapısına katılan bazı katkı maddeleri parçacıklardan çevreye geçebilir. Nanoplastiklerin çok küçük boyutları nedeniyle hücre zarlarından geçebilme olasılığı bulunmaktadır. Mikroplastik ve nanoplastiklerin insan sağlığına uzun süreli etkilerine ilişkin araştırmalar sürmektedir.</w:t>
       </w:r>
     </w:p>
+    <w:tbl>
+      <w:tblPr>
+        <w:tblW w:w="9000" w:type="dxa"/>
+        <w:jc w:val="center"/>
+        <w:tblBorders>
+          <w:top w:val="nil"/>
+          <w:left w:val="nil"/>
+          <w:bottom w:val="nil"/>
+          <w:right w:val="nil"/>
+          <w:insideH w:val="nil"/>
+          <w:insideV w:val="nil"/>
+        </w:tblBorders>
+        <w:tblLayout w:type="fixed"/>
+      </w:tblPr>
+      <w:tblGrid>
+        <w:gridCol w:w="4500"/>
+        <w:gridCol w:w="4500"/>
+      </w:tblGrid>
+      <w:tr>
+        <w:tc>
+          <w:tcPr>
+            <w:tcW w:w="4500" w:type="dxa"/>
+          </w:tcPr>
+          <w:p>
+            <w:pPr>
+              <w:jc w:val="center"/>
+            </w:pPr>
+            <w:r>
+              <w:drawing>
+                <wp:inline xmlns:a="http://schemas.openxmlformats.org/drawingml/2006/main" xmlns:pic="http://schemas.openxmlformats.org/drawingml/2006/picture">
+                  <wp:extent cx="2628000" cy="1653888"/>
+                  <wp:docPr id="900012" name="Picture 900012"/>
+                  <wp:cNvGraphicFramePr>
+                    <a:graphicFrameLocks noChangeAspect="1"/>
+                  </wp:cNvGraphicFramePr>
+                  <a:graphic>
+                    <a:graphicData uri="http://schemas.openxmlformats.org/drawingml/2006/picture">
+                      <pic:pic>
+                        <pic:nvPicPr>
+                          <pic:cNvPr id="0" name="2617003309_d.jpg"/>
+                          <pic:cNvPicPr/>
+                        </pic:nvPicPr>
+                        <pic:blipFill>
+                          <a:blip r:embed="rId17"/>
+                          <a:stretch>
+                            <a:fillRect/>
+                          </a:stretch>
+                        </pic:blipFill>
+                        <pic:spPr>
+                          <a:xfrm>
+                            <a:off x="0" y="0"/>
+                            <a:ext cx="2628000" cy="1653888"/>
+                          </a:xfrm>
+                          <a:prstGeom prst="rect"/>
+                        </pic:spPr>
+                      </pic:pic>
+                    </a:graphicData>
+                  </a:graphic>
+                </wp:inline>
+              </w:drawing>
+            </w:r>
+          </w:p>
+          <w:p>
+            <w:pPr>
+              <w:jc w:val="center"/>
+            </w:pPr>
+            <w:r>
+              <w:rPr>
+                <w:rFonts w:ascii="Times New Roman" w:hAnsi="Times New Roman" w:cs="Times New Roman"/>
+                <w:b/>
+                <w:bCs/>
+                <w:highlight w:val="yellow"/>
+                <w:lang w:val="tr-TR"/>
+              </w:rPr>
+              <w:t xml:space="preserve">Shutter id: 2617003309</w:t>
+            </w:r>
+          </w:p>
+          <w:p>
+            <w:pPr>
+              <w:jc w:val="center"/>
+              <w:rPr>
+                <w:rFonts w:ascii="Times New Roman" w:hAnsi="Times New Roman" w:cs="Times New Roman"/>
+                <w:lang w:val="tr-TR"/>
+              </w:rPr>
+            </w:pPr>
+            <w:r>
+              <w:rPr>
+                <w:rFonts w:ascii="Times New Roman" w:hAnsi="Times New Roman" w:cs="Times New Roman"/>
+                <w:b/>
+                <w:bCs/>
+                <w:lang w:val="tr-TR"/>
+              </w:rPr>
+              <w:t xml:space="preserve">Görsel G:</w:t>
+            </w:r>
+            <w:r>
+              <w:rPr>
+                <w:rFonts w:ascii="Times New Roman" w:hAnsi="Times New Roman" w:cs="Times New Roman"/>
+                <w:lang w:val="tr-TR"/>
+              </w:rPr>
+              <w:t xml:space="preserve"> Plastik atıkların arasında yüzen bir deniz kaplumbağası</w:t>
+            </w:r>
+          </w:p>
+        </w:tc>
+        <w:tc>
+          <w:tcPr>
+            <w:tcW w:w="4500" w:type="dxa"/>
+          </w:tcPr>
+          <w:p>
+            <w:pPr>
+              <w:jc w:val="center"/>
+            </w:pPr>
+            <w:r>
+              <w:drawing>
+                <wp:inline xmlns:a="http://schemas.openxmlformats.org/drawingml/2006/main" xmlns:pic="http://schemas.openxmlformats.org/drawingml/2006/picture">
+                  <wp:extent cx="2628000" cy="1963992"/>
+                  <wp:docPr id="900012" name="Picture 900012"/>
+                  <wp:cNvGraphicFramePr>
+                    <a:graphicFrameLocks noChangeAspect="1"/>
+                  </wp:cNvGraphicFramePr>
+                  <a:graphic>
+                    <a:graphicData uri="http://schemas.openxmlformats.org/drawingml/2006/picture">
+                      <pic:pic>
+                        <pic:nvPicPr>
+                          <pic:cNvPr id="0" name="2481480959_d.jpg"/>
+                          <pic:cNvPicPr/>
+                        </pic:nvPicPr>
+                        <pic:blipFill>
+                          <a:blip r:embed="rId18"/>
+                          <a:stretch>
+                            <a:fillRect/>
+                          </a:stretch>
+                        </pic:blipFill>
+                        <pic:spPr>
+                          <a:xfrm>
+                            <a:off x="0" y="0"/>
+                            <a:ext cx="2628000" cy="1963992"/>
+                          </a:xfrm>
+                          <a:prstGeom prst="rect"/>
+                        </pic:spPr>
+                      </pic:pic>
+                    </a:graphicData>
+                  </a:graphic>
+                </wp:inline>
+              </w:drawing>
+            </w:r>
+          </w:p>
+          <w:p>
+            <w:pPr>
+              <w:jc w:val="center"/>
+            </w:pPr>
+            <w:r>
+              <w:rPr>
+                <w:rFonts w:ascii="Times New Roman" w:hAnsi="Times New Roman" w:cs="Times New Roman"/>
+                <w:b/>
+                <w:bCs/>
+                <w:highlight w:val="yellow"/>
+                <w:lang w:val="tr-TR"/>
+              </w:rPr>
+              <w:t xml:space="preserve">Shutter id: 2481480959</w:t>
+            </w:r>
+          </w:p>
+          <w:p>
+            <w:pPr>
+              <w:jc w:val="center"/>
+              <w:rPr>
+                <w:rFonts w:ascii="Times New Roman" w:hAnsi="Times New Roman" w:cs="Times New Roman"/>
+                <w:lang w:val="tr-TR"/>
+              </w:rPr>
+            </w:pPr>
+            <w:r>
+              <w:rPr>
+                <w:rFonts w:ascii="Times New Roman" w:hAnsi="Times New Roman" w:cs="Times New Roman"/>
+                <w:b/>
+                <w:bCs/>
+                <w:lang w:val="tr-TR"/>
+              </w:rPr>
+              <w:t xml:space="preserve">Görsel H:</w:t>
+            </w:r>
+            <w:r>
+              <w:rPr>
+                <w:rFonts w:ascii="Times New Roman" w:hAnsi="Times New Roman" w:cs="Times New Roman"/>
+                <w:lang w:val="tr-TR"/>
+              </w:rPr>
+              <w:t xml:space="preserve"> Toprağa karışmış plastik parçacıklar</w:t>
+            </w:r>
+          </w:p>
+        </w:tc>
+      </w:tr>
+    </w:tbl>
     <w:p>
       <w:pPr>
         <w:jc w:val="both"/>
@@ -2385,9 +2763,198 @@
           <w:rFonts w:ascii="Times New Roman" w:hAnsi="Times New Roman" w:cs="Times New Roman"/>
           <w:lang w:val="tr-TR"/>
         </w:rPr>
-        <w:t xml:space="preserve">Mikroplastiklerin kaynakları ve çevrede yayılma yolları birlikte düşünüldüğünde, plastik parçacıklar doğaya karıştıktan sonra onları toplamanın neredeyse imkânsız olduğu, bu nedenle kirliliğin en etkili biçimde kaynağında önlenebileceği sonucuna ulaşılabilir. Mikroplastik kirliliğinin azaltılması için tek kullanımlık plastik ürünlerin kullanımının azaltılması, plastik atıkların ayrı toplanarak geri dönüştürülmesi, mikroboncuk içeren ürünlerin tercih edilmemesi, sentetik giysilerin daha az ve dolu makinede yıkanması, atıkların doğaya atılmaması gibi önlemler alınabilir.</w:t>
+        <w:t xml:space="preserve">Mikroplastiklerin kaynakları ve çevrede yayılma yolları birlikte düşünüldüğünde, plastik parçacıklar doğaya karıştıktan sonra onları toplamanın neredeyse imkânsız olduğu, bu nedenle kirliliğin en etkili biçimde kaynağında önlenebileceği sonucuna ulaşılabilir. Mikroplastik kirliliğinin azaltılması için tek kullanımlık plastik ürünlerin kullanımının azaltılması (Görsel I), plastik atıkların ayrı toplanarak geri dönüştürülmesi, mikroboncuk içeren ürünlerin tercih edilmemesi, sentetik giysilerin daha az ve dolu makinede yıkanması, atıkların doğaya atılmaması (Görsel J) gibi önlemler alınabilir.</w:t>
       </w:r>
     </w:p>
+    <w:tbl>
+      <w:tblPr>
+        <w:tblW w:w="9000" w:type="dxa"/>
+        <w:jc w:val="center"/>
+        <w:tblBorders>
+          <w:top w:val="nil"/>
+          <w:left w:val="nil"/>
+          <w:bottom w:val="nil"/>
+          <w:right w:val="nil"/>
+          <w:insideH w:val="nil"/>
+          <w:insideV w:val="nil"/>
+        </w:tblBorders>
+        <w:tblLayout w:type="fixed"/>
+      </w:tblPr>
+      <w:tblGrid>
+        <w:gridCol w:w="4500"/>
+        <w:gridCol w:w="4500"/>
+      </w:tblGrid>
+      <w:tr>
+        <w:tc>
+          <w:tcPr>
+            <w:tcW w:w="4500" w:type="dxa"/>
+          </w:tcPr>
+          <w:p>
+            <w:pPr>
+              <w:jc w:val="center"/>
+            </w:pPr>
+            <w:r>
+              <w:drawing>
+                <wp:inline xmlns:a="http://schemas.openxmlformats.org/drawingml/2006/main" xmlns:pic="http://schemas.openxmlformats.org/drawingml/2006/picture">
+                  <wp:extent cx="2628000" cy="1916688"/>
+                  <wp:docPr id="900013" name="Picture 900013"/>
+                  <wp:cNvGraphicFramePr>
+                    <a:graphicFrameLocks noChangeAspect="1"/>
+                  </wp:cNvGraphicFramePr>
+                  <a:graphic>
+                    <a:graphicData uri="http://schemas.openxmlformats.org/drawingml/2006/picture">
+                      <pic:pic>
+                        <pic:nvPicPr>
+                          <pic:cNvPr id="0" name="2800759929_d.jpg"/>
+                          <pic:cNvPicPr/>
+                        </pic:nvPicPr>
+                        <pic:blipFill>
+                          <a:blip r:embed="rId19"/>
+                          <a:stretch>
+                            <a:fillRect/>
+                          </a:stretch>
+                        </pic:blipFill>
+                        <pic:spPr>
+                          <a:xfrm>
+                            <a:off x="0" y="0"/>
+                            <a:ext cx="2628000" cy="1916688"/>
+                          </a:xfrm>
+                          <a:prstGeom prst="rect"/>
+                        </pic:spPr>
+                      </pic:pic>
+                    </a:graphicData>
+                  </a:graphic>
+                </wp:inline>
+              </w:drawing>
+            </w:r>
+          </w:p>
+          <w:p>
+            <w:pPr>
+              <w:jc w:val="center"/>
+            </w:pPr>
+            <w:r>
+              <w:rPr>
+                <w:rFonts w:ascii="Times New Roman" w:hAnsi="Times New Roman" w:cs="Times New Roman"/>
+                <w:b/>
+                <w:bCs/>
+                <w:highlight w:val="yellow"/>
+                <w:lang w:val="tr-TR"/>
+              </w:rPr>
+              <w:t xml:space="preserve">Shutter id: 2800759929</w:t>
+            </w:r>
+          </w:p>
+          <w:p>
+            <w:pPr>
+              <w:jc w:val="center"/>
+              <w:rPr>
+                <w:rFonts w:ascii="Times New Roman" w:hAnsi="Times New Roman" w:cs="Times New Roman"/>
+                <w:lang w:val="tr-TR"/>
+              </w:rPr>
+            </w:pPr>
+            <w:r>
+              <w:rPr>
+                <w:rFonts w:ascii="Times New Roman" w:hAnsi="Times New Roman" w:cs="Times New Roman"/>
+                <w:b/>
+                <w:bCs/>
+                <w:lang w:val="tr-TR"/>
+              </w:rPr>
+              <w:t xml:space="preserve">Görsel I:</w:t>
+            </w:r>
+            <w:r>
+              <w:rPr>
+                <w:rFonts w:ascii="Times New Roman" w:hAnsi="Times New Roman" w:cs="Times New Roman"/>
+                <w:lang w:val="tr-TR"/>
+              </w:rPr>
+              <w:t xml:space="preserve"> Alışverişte bez file ve bez çanta kullanımı</w:t>
+            </w:r>
+          </w:p>
+        </w:tc>
+        <w:tc>
+          <w:tcPr>
+            <w:tcW w:w="4500" w:type="dxa"/>
+          </w:tcPr>
+          <w:p>
+            <w:pPr>
+              <w:jc w:val="center"/>
+            </w:pPr>
+            <w:r>
+              <w:drawing>
+                <wp:inline xmlns:a="http://schemas.openxmlformats.org/drawingml/2006/main" xmlns:pic="http://schemas.openxmlformats.org/drawingml/2006/picture">
+                  <wp:extent cx="2628000" cy="1928952"/>
+                  <wp:docPr id="900013" name="Picture 900013"/>
+                  <wp:cNvGraphicFramePr>
+                    <a:graphicFrameLocks noChangeAspect="1"/>
+                  </wp:cNvGraphicFramePr>
+                  <a:graphic>
+                    <a:graphicData uri="http://schemas.openxmlformats.org/drawingml/2006/picture">
+                      <pic:pic>
+                        <pic:nvPicPr>
+                          <pic:cNvPr id="0" name="2219213261_d.jpg"/>
+                          <pic:cNvPicPr/>
+                        </pic:nvPicPr>
+                        <pic:blipFill>
+                          <a:blip r:embed="rId20"/>
+                          <a:stretch>
+                            <a:fillRect/>
+                          </a:stretch>
+                        </pic:blipFill>
+                        <pic:spPr>
+                          <a:xfrm>
+                            <a:off x="0" y="0"/>
+                            <a:ext cx="2628000" cy="1928952"/>
+                          </a:xfrm>
+                          <a:prstGeom prst="rect"/>
+                        </pic:spPr>
+                      </pic:pic>
+                    </a:graphicData>
+                  </a:graphic>
+                </wp:inline>
+              </w:drawing>
+            </w:r>
+          </w:p>
+          <w:p>
+            <w:pPr>
+              <w:jc w:val="center"/>
+            </w:pPr>
+            <w:r>
+              <w:rPr>
+                <w:rFonts w:ascii="Times New Roman" w:hAnsi="Times New Roman" w:cs="Times New Roman"/>
+                <w:b/>
+                <w:bCs/>
+                <w:highlight w:val="yellow"/>
+                <w:lang w:val="tr-TR"/>
+              </w:rPr>
+              <w:t xml:space="preserve">Shutter id: 2219213261</w:t>
+            </w:r>
+          </w:p>
+          <w:p>
+            <w:pPr>
+              <w:jc w:val="center"/>
+              <w:rPr>
+                <w:rFonts w:ascii="Times New Roman" w:hAnsi="Times New Roman" w:cs="Times New Roman"/>
+                <w:lang w:val="tr-TR"/>
+              </w:rPr>
+            </w:pPr>
+            <w:r>
+              <w:rPr>
+                <w:rFonts w:ascii="Times New Roman" w:hAnsi="Times New Roman" w:cs="Times New Roman"/>
+                <w:b/>
+                <w:bCs/>
+                <w:lang w:val="tr-TR"/>
+              </w:rPr>
+              <w:t xml:space="preserve">Görsel J:</w:t>
+            </w:r>
+            <w:r>
+              <w:rPr>
+                <w:rFonts w:ascii="Times New Roman" w:hAnsi="Times New Roman" w:cs="Times New Roman"/>
+                <w:lang w:val="tr-TR"/>
+              </w:rPr>
+              <w:t xml:space="preserve"> Plajda plastik şişe toplayan bir çocuk</w:t>
+            </w:r>
+          </w:p>
+        </w:tc>
+      </w:tr>
+    </w:tbl>
     <w:p>
       <w:pPr>
         <w:keepNext/>
@@ -2426,6 +2993,195 @@
         <w:t xml:space="preserve">Market fişleri, banka sıra numarası kâğıtları ve bazı faturalar gibi ürünlerde kullanılan termal kâğıtlarda bisfenol A (BPA) adı verilen bir madde bulunabilir. BPA, bazı plastiklerin ve kaplamaların üretiminde de kullanılan ve hormon sistemini etkileyebileceği için birçok ülkede kullanımı sınırlandırılan bir maddedir. Termal kâğıtlarla temas eden ellerden ve bu kâğıtlara sarılan yağlı yiyeceklerden BPA’nın vücuda geçebileceği belirtilmektedir. Fişleri gereksiz yere almamak, yiyecekleri termal kâğıtlarla temas ettirmemek ve fişlere dokunduktan sonra ellerimizi yıkamak alınabilecek basit önlemlerdir. BPA hakkında araştırma yaparak toplumu bilgilendirmeye yönelik bir el ilanı hazırlayabilirsiniz.</w:t>
       </w:r>
     </w:p>
+    <w:tbl>
+      <w:tblPr>
+        <w:tblW w:w="9000" w:type="dxa"/>
+        <w:jc w:val="center"/>
+        <w:tblBorders>
+          <w:top w:val="nil"/>
+          <w:left w:val="nil"/>
+          <w:bottom w:val="nil"/>
+          <w:right w:val="nil"/>
+          <w:insideH w:val="nil"/>
+          <w:insideV w:val="nil"/>
+        </w:tblBorders>
+        <w:tblLayout w:type="fixed"/>
+      </w:tblPr>
+      <w:tblGrid>
+        <w:gridCol w:w="4500"/>
+        <w:gridCol w:w="4500"/>
+      </w:tblGrid>
+      <w:tr>
+        <w:tc>
+          <w:tcPr>
+            <w:tcW w:w="4500" w:type="dxa"/>
+          </w:tcPr>
+          <w:p>
+            <w:pPr>
+              <w:jc w:val="center"/>
+            </w:pPr>
+            <w:r>
+              <w:drawing>
+                <wp:inline xmlns:a="http://schemas.openxmlformats.org/drawingml/2006/main" xmlns:pic="http://schemas.openxmlformats.org/drawingml/2006/picture">
+                  <wp:extent cx="2628000" cy="1927200"/>
+                  <wp:docPr id="900014" name="Picture 900014"/>
+                  <wp:cNvGraphicFramePr>
+                    <a:graphicFrameLocks noChangeAspect="1"/>
+                  </wp:cNvGraphicFramePr>
+                  <a:graphic>
+                    <a:graphicData uri="http://schemas.openxmlformats.org/drawingml/2006/picture">
+                      <pic:pic>
+                        <pic:nvPicPr>
+                          <pic:cNvPr id="0" name="2693942183_d.jpg"/>
+                          <pic:cNvPicPr/>
+                        </pic:nvPicPr>
+                        <pic:blipFill>
+                          <a:blip r:embed="rId21"/>
+                          <a:stretch>
+                            <a:fillRect/>
+                          </a:stretch>
+                        </pic:blipFill>
+                        <pic:spPr>
+                          <a:xfrm>
+                            <a:off x="0" y="0"/>
+                            <a:ext cx="2628000" cy="1927200"/>
+                          </a:xfrm>
+                          <a:prstGeom prst="rect"/>
+                        </pic:spPr>
+                      </pic:pic>
+                    </a:graphicData>
+                  </a:graphic>
+                </wp:inline>
+              </w:drawing>
+            </w:r>
+          </w:p>
+          <w:p>
+            <w:pPr>
+              <w:jc w:val="center"/>
+            </w:pPr>
+            <w:r>
+              <w:rPr>
+                <w:rFonts w:ascii="Times New Roman" w:hAnsi="Times New Roman" w:cs="Times New Roman"/>
+                <w:b/>
+                <w:bCs/>
+                <w:highlight w:val="yellow"/>
+                <w:lang w:val="tr-TR"/>
+              </w:rPr>
+              <w:t xml:space="preserve">Shutter id: 2693942183</w:t>
+            </w:r>
+          </w:p>
+          <w:p>
+            <w:pPr>
+              <w:jc w:val="center"/>
+              <w:rPr>
+                <w:rFonts w:ascii="Times New Roman" w:hAnsi="Times New Roman" w:cs="Times New Roman"/>
+                <w:lang w:val="tr-TR"/>
+              </w:rPr>
+            </w:pPr>
+            <w:r>
+              <w:rPr>
+                <w:rFonts w:ascii="Times New Roman" w:hAnsi="Times New Roman" w:cs="Times New Roman"/>
+                <w:b/>
+                <w:bCs/>
+                <w:lang w:val="tr-TR"/>
+              </w:rPr>
+              <w:t xml:space="preserve"/>
+            </w:r>
+            <w:r>
+              <w:rPr>
+                <w:rFonts w:ascii="Times New Roman" w:hAnsi="Times New Roman" w:cs="Times New Roman"/>
+                <w:lang w:val="tr-TR"/>
+              </w:rPr>
+              <w:t xml:space="preserve">Fiş yazıcısı ve termal kâğıt ruloları</w:t>
+            </w:r>
+          </w:p>
+        </w:tc>
+        <w:tc>
+          <w:tcPr>
+            <w:tcW w:w="4500" w:type="dxa"/>
+          </w:tcPr>
+          <w:p>
+            <w:pPr>
+              <w:jc w:val="center"/>
+            </w:pPr>
+            <w:r>
+              <w:drawing>
+                <wp:inline xmlns:a="http://schemas.openxmlformats.org/drawingml/2006/main" xmlns:pic="http://schemas.openxmlformats.org/drawingml/2006/picture">
+                  <wp:extent cx="2628000" cy="1930704"/>
+                  <wp:docPr id="900014" name="Picture 900014"/>
+                  <wp:cNvGraphicFramePr>
+                    <a:graphicFrameLocks noChangeAspect="1"/>
+                  </wp:cNvGraphicFramePr>
+                  <a:graphic>
+                    <a:graphicData uri="http://schemas.openxmlformats.org/drawingml/2006/picture">
+                      <pic:pic>
+                        <pic:nvPicPr>
+                          <pic:cNvPr id="0" name="2794717813_d.jpg"/>
+                          <pic:cNvPicPr/>
+                        </pic:nvPicPr>
+                        <pic:blipFill>
+                          <a:blip r:embed="rId22"/>
+                          <a:stretch>
+                            <a:fillRect/>
+                          </a:stretch>
+                        </pic:blipFill>
+                        <pic:spPr>
+                          <a:xfrm>
+                            <a:off x="0" y="0"/>
+                            <a:ext cx="2628000" cy="1930704"/>
+                          </a:xfrm>
+                          <a:prstGeom prst="rect"/>
+                        </pic:spPr>
+                      </pic:pic>
+                    </a:graphicData>
+                  </a:graphic>
+                </wp:inline>
+              </w:drawing>
+            </w:r>
+          </w:p>
+          <w:p>
+            <w:pPr>
+              <w:jc w:val="center"/>
+            </w:pPr>
+            <w:r>
+              <w:rPr>
+                <w:rFonts w:ascii="Times New Roman" w:hAnsi="Times New Roman" w:cs="Times New Roman"/>
+                <w:b/>
+                <w:bCs/>
+                <w:highlight w:val="yellow"/>
+                <w:lang w:val="tr-TR"/>
+              </w:rPr>
+              <w:t xml:space="preserve">Shutter id: 2794717813</w:t>
+            </w:r>
+          </w:p>
+          <w:p>
+            <w:pPr>
+              <w:jc w:val="center"/>
+              <w:rPr>
+                <w:rFonts w:ascii="Times New Roman" w:hAnsi="Times New Roman" w:cs="Times New Roman"/>
+                <w:lang w:val="tr-TR"/>
+              </w:rPr>
+            </w:pPr>
+            <w:r>
+              <w:rPr>
+                <w:rFonts w:ascii="Times New Roman" w:hAnsi="Times New Roman" w:cs="Times New Roman"/>
+                <w:b/>
+                <w:bCs/>
+                <w:lang w:val="tr-TR"/>
+              </w:rPr>
+              <w:t xml:space="preserve"/>
+            </w:r>
+            <w:r>
+              <w:rPr>
+                <w:rFonts w:ascii="Times New Roman" w:hAnsi="Times New Roman" w:cs="Times New Roman"/>
+                <w:lang w:val="tr-TR"/>
+              </w:rPr>
+              <w:t xml:space="preserve">Sabunla el yıkama</w:t>
+            </w:r>
+          </w:p>
+        </w:tc>
+      </w:tr>
+    </w:tbl>
     <w:p>
       <w:pPr>
         <w:pStyle w:val="ListParagraph"/>

</xml_diff>